<commit_message>
OE3 deliverable and annexes regenerated from src (personajes-animados, INC-131 to INC-133)
</commit_message>
<xml_diff>
--- a/docs/anexos oe3/Solucion_OE3_Anexo_A_Matriz_trazabilidad.docx
+++ b/docs/anexos oe3/Solucion_OE3_Anexo_A_Matriz_trazabilidad.docx
@@ -4296,7 +4296,7 @@
     </w:tbl>
     <w:p>
       <w:pPr>
-        <w:pStyle w:val="TextoOE3"/>
+        <w:pStyle w:val="PrimerprrafoOE3"/>
         <w:keepNext/>
       </w:pPr>
       <w:r>
@@ -6497,7 +6497,7 @@
     </w:tbl>
     <w:p>
       <w:pPr>
-        <w:pStyle w:val="TextoOE3"/>
+        <w:pStyle w:val="PrimerprrafoOE3"/>
       </w:pPr>
       <w:r>
         <w:t>Todos los requerimientos funcionales tienen al menos una prueba que los nombra; no hay RF sin prueba.</w:t>
@@ -6701,7 +6701,7 @@
   <w:abstractNum w:abstractNumId="0" w15:restartNumberingAfterBreak="0">
     <w:nsid w:val="0000A990"/>
     <w:multiLevelType w:val="multilevel"/>
-    <w:tmpl w:val="A54AB3E8"/>
+    <w:tmpl w:val="BC84A3EC"/>
     <w:lvl w:ilvl="0">
       <w:numFmt w:val="bullet"/>
       <w:lvlText w:val=" "/>
@@ -6974,16 +6974,16 @@
       </w:pPr>
     </w:lvl>
   </w:abstractNum>
-  <w:num w:numId="1" w16cid:durableId="1019820532">
+  <w:num w:numId="1" w16cid:durableId="811677325">
     <w:abstractNumId w:val="1"/>
   </w:num>
-  <w:num w:numId="2" w16cid:durableId="608389478">
+  <w:num w:numId="2" w16cid:durableId="2002806821">
     <w:abstractNumId w:val="2"/>
     <w:lvlOverride w:ilvl="0">
       <w:startOverride w:val="1"/>
     </w:lvlOverride>
   </w:num>
-  <w:num w:numId="3" w16cid:durableId="2008247391">
+  <w:num w:numId="3" w16cid:durableId="130367639">
     <w:abstractNumId w:val="0"/>
   </w:num>
 </w:numbering>
@@ -7789,7 +7789,7 @@
     <w:link w:val="EncabezadoCar"/>
     <w:uiPriority w:val="99"/>
     <w:unhideWhenUsed/>
-    <w:rsid w:val="003D5245"/>
+    <w:rsid w:val="00D9698D"/>
     <w:pPr>
       <w:tabs>
         <w:tab w:val="center" w:pos="4419"/>
@@ -7803,7 +7803,7 @@
     <w:basedOn w:val="Fuentedeprrafopredeter"/>
     <w:link w:val="Encabezado"/>
     <w:uiPriority w:val="99"/>
-    <w:rsid w:val="003D5245"/>
+    <w:rsid w:val="00D9698D"/>
   </w:style>
   <w:style w:type="paragraph" w:styleId="Piedepgina">
     <w:name w:val="footer"/>
@@ -7811,7 +7811,7 @@
     <w:link w:val="PiedepginaCar"/>
     <w:uiPriority w:val="99"/>
     <w:unhideWhenUsed/>
-    <w:rsid w:val="003D5245"/>
+    <w:rsid w:val="00D9698D"/>
     <w:pPr>
       <w:tabs>
         <w:tab w:val="center" w:pos="4419"/>
@@ -7825,7 +7825,7 @@
     <w:basedOn w:val="Fuentedeprrafopredeter"/>
     <w:link w:val="Piedepgina"/>
     <w:uiPriority w:val="99"/>
-    <w:rsid w:val="003D5245"/>
+    <w:rsid w:val="00D9698D"/>
   </w:style>
   <w:style w:type="character" w:styleId="Nmerodepgina">
     <w:name w:val="page number"/>
@@ -7833,7 +7833,7 @@
     <w:uiPriority w:val="99"/>
     <w:semiHidden/>
     <w:unhideWhenUsed/>
-    <w:rsid w:val="003D5245"/>
+    <w:rsid w:val="00D9698D"/>
   </w:style>
 </w:styles>
 </file>

</xml_diff>

<commit_message>
OE3 republished: profile view, two-frame blink, Algoritm's final design, INC-146 and INC-147
build.py --publish over 380cbe5 with the sources that record INC-134 to INC-136 (the family seen in profile while moving, the two-frame blink, Algoritm's final design with a provisional face), the Editor round 2 (suite2 EditMode 710 passed and 1 skipped of 711, PlayMode 417/417), INC-146 (five N1 props at 256 px; package 499,3 MB to 420,6 MB) and INC-147 (Algoritm's arms behind his whole body), with Figure F.2 redrawn.
</commit_message>
<xml_diff>
--- a/docs/anexos oe3/Solucion_OE3_Anexo_A_Matriz_trazabilidad.docx
+++ b/docs/anexos oe3/Solucion_OE3_Anexo_A_Matriz_trazabilidad.docx
@@ -6701,7 +6701,7 @@
   <w:abstractNum w:abstractNumId="0" w15:restartNumberingAfterBreak="0">
     <w:nsid w:val="0000A990"/>
     <w:multiLevelType w:val="multilevel"/>
-    <w:tmpl w:val="103415C2"/>
+    <w:tmpl w:val="863885A6"/>
     <w:lvl w:ilvl="0">
       <w:numFmt w:val="bullet"/>
       <w:lvlText w:val=" "/>
@@ -6974,16 +6974,16 @@
       </w:pPr>
     </w:lvl>
   </w:abstractNum>
-  <w:num w:numId="1" w16cid:durableId="1788890545">
+  <w:num w:numId="1" w16cid:durableId="1480537371">
     <w:abstractNumId w:val="1"/>
   </w:num>
-  <w:num w:numId="2" w16cid:durableId="1007441245">
+  <w:num w:numId="2" w16cid:durableId="1272204868">
     <w:abstractNumId w:val="2"/>
     <w:lvlOverride w:ilvl="0">
       <w:startOverride w:val="1"/>
     </w:lvlOverride>
   </w:num>
-  <w:num w:numId="3" w16cid:durableId="1622417935">
+  <w:num w:numId="3" w16cid:durableId="456068399">
     <w:abstractNumId w:val="0"/>
   </w:num>
 </w:numbering>
@@ -7789,7 +7789,7 @@
     <w:link w:val="EncabezadoCar"/>
     <w:uiPriority w:val="99"/>
     <w:unhideWhenUsed/>
-    <w:rsid w:val="00491B52"/>
+    <w:rsid w:val="0027118C"/>
     <w:pPr>
       <w:tabs>
         <w:tab w:val="center" w:pos="4419"/>
@@ -7803,7 +7803,7 @@
     <w:basedOn w:val="Fuentedeprrafopredeter"/>
     <w:link w:val="Encabezado"/>
     <w:uiPriority w:val="99"/>
-    <w:rsid w:val="00491B52"/>
+    <w:rsid w:val="0027118C"/>
   </w:style>
   <w:style w:type="paragraph" w:styleId="Piedepgina">
     <w:name w:val="footer"/>
@@ -7811,7 +7811,7 @@
     <w:link w:val="PiedepginaCar"/>
     <w:uiPriority w:val="99"/>
     <w:unhideWhenUsed/>
-    <w:rsid w:val="00491B52"/>
+    <w:rsid w:val="0027118C"/>
     <w:pPr>
       <w:tabs>
         <w:tab w:val="center" w:pos="4419"/>
@@ -7825,7 +7825,7 @@
     <w:basedOn w:val="Fuentedeprrafopredeter"/>
     <w:link w:val="Piedepgina"/>
     <w:uiPriority w:val="99"/>
-    <w:rsid w:val="00491B52"/>
+    <w:rsid w:val="0027118C"/>
   </w:style>
   <w:style w:type="character" w:styleId="Nmerodepgina">
     <w:name w:val="page number"/>
@@ -7833,7 +7833,7 @@
     <w:uiPriority w:val="99"/>
     <w:semiHidden/>
     <w:unhideWhenUsed/>
-    <w:rsid w:val="00491B52"/>
+    <w:rsid w:val="0027118C"/>
   </w:style>
 </w:styles>
 </file>

</xml_diff>

<commit_message>
OE3 republished: expressions per the guion, animated dialogue card, faces and portraits at 256 px and the campfire mirror (INC-148 to INC-150)
</commit_message>
<xml_diff>
--- a/docs/anexos oe3/Solucion_OE3_Anexo_A_Matriz_trazabilidad.docx
+++ b/docs/anexos oe3/Solucion_OE3_Anexo_A_Matriz_trazabilidad.docx
@@ -6701,7 +6701,7 @@
   <w:abstractNum w:abstractNumId="0" w15:restartNumberingAfterBreak="0">
     <w:nsid w:val="0000A990"/>
     <w:multiLevelType w:val="multilevel"/>
-    <w:tmpl w:val="863885A6"/>
+    <w:tmpl w:val="83EEB71E"/>
     <w:lvl w:ilvl="0">
       <w:numFmt w:val="bullet"/>
       <w:lvlText w:val=" "/>
@@ -6974,16 +6974,16 @@
       </w:pPr>
     </w:lvl>
   </w:abstractNum>
-  <w:num w:numId="1" w16cid:durableId="1480537371">
+  <w:num w:numId="1" w16cid:durableId="2018728117">
     <w:abstractNumId w:val="1"/>
   </w:num>
-  <w:num w:numId="2" w16cid:durableId="1272204868">
+  <w:num w:numId="2" w16cid:durableId="25297422">
     <w:abstractNumId w:val="2"/>
     <w:lvlOverride w:ilvl="0">
       <w:startOverride w:val="1"/>
     </w:lvlOverride>
   </w:num>
-  <w:num w:numId="3" w16cid:durableId="456068399">
+  <w:num w:numId="3" w16cid:durableId="1806777062">
     <w:abstractNumId w:val="0"/>
   </w:num>
 </w:numbering>
@@ -7789,7 +7789,7 @@
     <w:link w:val="EncabezadoCar"/>
     <w:uiPriority w:val="99"/>
     <w:unhideWhenUsed/>
-    <w:rsid w:val="0027118C"/>
+    <w:rsid w:val="00EB1D52"/>
     <w:pPr>
       <w:tabs>
         <w:tab w:val="center" w:pos="4419"/>
@@ -7803,7 +7803,7 @@
     <w:basedOn w:val="Fuentedeprrafopredeter"/>
     <w:link w:val="Encabezado"/>
     <w:uiPriority w:val="99"/>
-    <w:rsid w:val="0027118C"/>
+    <w:rsid w:val="00EB1D52"/>
   </w:style>
   <w:style w:type="paragraph" w:styleId="Piedepgina">
     <w:name w:val="footer"/>
@@ -7811,7 +7811,7 @@
     <w:link w:val="PiedepginaCar"/>
     <w:uiPriority w:val="99"/>
     <w:unhideWhenUsed/>
-    <w:rsid w:val="0027118C"/>
+    <w:rsid w:val="00EB1D52"/>
     <w:pPr>
       <w:tabs>
         <w:tab w:val="center" w:pos="4419"/>
@@ -7825,7 +7825,7 @@
     <w:basedOn w:val="Fuentedeprrafopredeter"/>
     <w:link w:val="Piedepgina"/>
     <w:uiPriority w:val="99"/>
-    <w:rsid w:val="0027118C"/>
+    <w:rsid w:val="00EB1D52"/>
   </w:style>
   <w:style w:type="character" w:styleId="Nmerodepgina">
     <w:name w:val="page number"/>
@@ -7833,7 +7833,7 @@
     <w:uiPriority w:val="99"/>
     <w:semiHidden/>
     <w:unhideWhenUsed/>
-    <w:rsid w:val="0027118C"/>
+    <w:rsid w:val="00EB1D52"/>
   </w:style>
 </w:styles>
 </file>

</xml_diff>